<commit_message>
fix(notasi): Modul-Word/PDF TTL Modul 14 dan CAD Modul 12
buat-modul-word.py → docx-ke-pdf.py (LibreOffice) → pasang-tautan-pdf →
gabung-pdf-modul.py:
- TTL Modul 14: butir Bahan kajian dan Indikator dari RPS menulis Y_bus
  dengan subskrip sungguhan (hanya document.xml berubah).
- CAD Modul 12: Gambar 4 tidak lagi memecah σmaks = Kt · σnom antarbaris
  (hanya image16.png berubah).
Jumlah halaman tetap: TTL M14 21, CAD M12 25; Modul-Gabungan TTL 306
(hanya halaman 287 berubah teks) dan CAD 307. Gabungan course lain tidak
disertakan karena sumbernya tidak berubah.

Co-Authored-By: Claude Opus 5.5 <noreply@anthropic.com>
</commit_message>
<xml_diff>
--- a/Teknik-Tenaga-Listrik/Modul-Word/Modul-14-Metode-Analisis-Aliran-Daya-Load-Flow.docx
+++ b/Teknik-Tenaga-Listrik/Modul-Word/Modul-14-Metode-Analisis-Aliran-Daya-Load-Flow.docx
@@ -2750,7 +2750,26 @@
           <w:i w:val="0"/>
           <w:sz w:val="22"/>
         </w:rPr>
-        <w:t>Klasifikasi bus dan matriks Y_bus; Persamaan aliran daya; Gauss–Seidel dan Newton–Raphson; Aliran daya DC dan pembacaan hasil.</w:t>
+        <w:t>Klasifikasi bus dan matriks Y</w:t>
+      </w:r>
+      <w:r>
+        <w:rPr>
+          <w:rFonts w:ascii="Arial" w:hAnsi="Arial" w:eastAsia="Arial" w:cs="Arial"/>
+          <w:b w:val="0"/>
+          <w:i w:val="0"/>
+          <w:sz w:val="22"/>
+          <w:vertAlign w:val="subscript"/>
+        </w:rPr>
+        <w:t>bus</w:t>
+      </w:r>
+      <w:r>
+        <w:rPr>
+          <w:rFonts w:ascii="Arial" w:hAnsi="Arial" w:eastAsia="Arial" w:cs="Arial"/>
+          <w:b w:val="0"/>
+          <w:i w:val="0"/>
+          <w:sz w:val="22"/>
+        </w:rPr>
+        <w:t>; Persamaan aliran daya; Gauss–Seidel dan Newton–Raphson; Aliran daya DC dan pembacaan hasil.</w:t>
       </w:r>
     </w:p>
     <w:p>
@@ -2783,7 +2802,26 @@
           <w:i w:val="0"/>
           <w:sz w:val="22"/>
         </w:rPr>
-        <w:t>Ketepatan menyusun Y_bus dan persamaan aliran daya; Ketepatan menjalankan iterasi dan membaca hasilnya.</w:t>
+        <w:t>Ketepatan menyusun Y</w:t>
+      </w:r>
+      <w:r>
+        <w:rPr>
+          <w:rFonts w:ascii="Arial" w:hAnsi="Arial" w:eastAsia="Arial" w:cs="Arial"/>
+          <w:b w:val="0"/>
+          <w:i w:val="0"/>
+          <w:sz w:val="22"/>
+          <w:vertAlign w:val="subscript"/>
+        </w:rPr>
+        <w:t>bus</w:t>
+      </w:r>
+      <w:r>
+        <w:rPr>
+          <w:rFonts w:ascii="Arial" w:hAnsi="Arial" w:eastAsia="Arial" w:cs="Arial"/>
+          <w:b w:val="0"/>
+          <w:i w:val="0"/>
+          <w:sz w:val="22"/>
+        </w:rPr>
+        <w:t xml:space="preserve"> dan persamaan aliran daya; Ketepatan menjalankan iterasi dan membaca hasilnya.</w:t>
       </w:r>
     </w:p>
     <w:p>

</xml_diff>